<commit_message>
Localize submission documents to Chinese
</commit_message>
<xml_diff>
--- a/hashjoin-cpu/docs/COURSE_REPORT.docx
+++ b/hashjoin-cpu/docs/COURSE_REPORT.docx
@@ -25,7 +25,7 @@
         <w:pStyle w:val="FirstParagraph"/>
       </w:pPr>
       <w:r>
-        <w:t xml:space="preserve">本课程项目以 ETH Zurich VLDB 2013 main-memory hash join 开源代码为基础，将本学期练习、期中报告和期末报告统一整合到同一个 hashjoin 框架中。CPU 端实验通过命令行开关选择不同算法；GPU 端实验可作为独立扩展项目提交。</w:t>
+        <w:t xml:space="preserve">本课程项目以 ETH Zurich VLDB 2013 main-memory hash join 开源代码为基础，将本学期练习、期中报告和期末报告统一整合到同一个 hashjoin 框架中。CPU 端实验通过命令行开关选择不同算法；GPU 端 TPC-H Q5 实验作为同一课程仓库中的独立扩展项目提交。</w:t>
       </w:r>
     </w:p>
     <w:p>
@@ -33,7 +33,7 @@
         <w:pStyle w:val="BodyText"/>
       </w:pPr>
       <w:r>
-        <w:t xml:space="preserve">开源项目链接建议使用个人 fork：</w:t>
+        <w:t xml:space="preserve">开源项目链接：</w:t>
       </w:r>
     </w:p>
     <w:p>
@@ -44,7 +44,7 @@
         <w:rPr>
           <w:rStyle w:val="VerbatimChar"/>
         </w:rPr>
-        <w:t xml:space="preserve">https://github.com/zihuanxu/vldb13-eth-hashjoin</w:t>
+        <w:t xml:space="preserve">https://github.com/zihuanxu/db-tpch-q5</w:t>
       </w:r>
     </w:p>
     <w:p>
@@ -52,26 +52,37 @@
         <w:pStyle w:val="FirstParagraph"/>
       </w:pPr>
       <w:r>
-        <w:t xml:space="preserve">当前本地远端仍是原始上游：</w:t>
-      </w:r>
-    </w:p>
-    <w:p>
-      <w:pPr>
-        <w:pStyle w:val="SourceCode"/>
-      </w:pPr>
+        <w:t xml:space="preserve">其中 CPU hashjoin 代码、实验脚本和报告位于</w:t>
+      </w:r>
+      <w:r>
+        <w:t xml:space="preserve"> </w:t>
+      </w:r>
       <w:r>
         <w:rPr>
           <w:rStyle w:val="VerbatimChar"/>
         </w:rPr>
-        <w:t xml:space="preserve">https://github.com/mars-research/vldb13-eth-hashjoin.git</w:t>
-      </w:r>
-    </w:p>
-    <w:p>
-      <w:pPr>
-        <w:pStyle w:val="FirstParagraph"/>
-      </w:pPr>
-      <w:r>
-        <w:t xml:space="preserve">提交前需要把远端改为个人仓库或 fork，并推送本项目分支。</w:t>
+        <w:t xml:space="preserve">hashjoin-cpu/</w:t>
+      </w:r>
+      <w:r>
+        <w:t xml:space="preserve"> </w:t>
+      </w:r>
+      <w:r>
+        <w:t xml:space="preserve">子目录；TPC-H Q5/GPU 代码、实验脚本和报告位于仓库根目录及</w:t>
+      </w:r>
+      <w:r>
+        <w:t xml:space="preserve"> </w:t>
+      </w:r>
+      <w:r>
+        <w:rPr>
+          <w:rStyle w:val="VerbatimChar"/>
+        </w:rPr>
+        <w:t xml:space="preserve">docs/</w:t>
+      </w:r>
+      <w:r>
+        <w:t xml:space="preserve"> </w:t>
+      </w:r>
+      <w:r>
+        <w:t xml:space="preserve">目录。</w:t>
       </w:r>
     </w:p>
     <w:bookmarkEnd w:id="20"/>
@@ -6004,7 +6015,19 @@
         <w:pStyle w:val="Compact"/>
       </w:pPr>
       <w:r>
-        <w:t xml:space="preserve">GPU 端实验不在本仓库内，若课程最终要求一起提交，应作为单独 GPU 项目链接或附件补充。</w:t>
+        <w:t xml:space="preserve">GPU 端实验位于同一整合仓库根目录，最终报告为</w:t>
+      </w:r>
+      <w:r>
+        <w:t xml:space="preserve"> </w:t>
+      </w:r>
+      <w:r>
+        <w:rPr>
+          <w:rStyle w:val="VerbatimChar"/>
+        </w:rPr>
+        <w:t xml:space="preserve">docs/FINAL_REPORT.md/.docx</w:t>
+      </w:r>
+      <w:r>
+        <w:t xml:space="preserve">。</w:t>
       </w:r>
     </w:p>
     <w:bookmarkEnd w:id="38"/>

</xml_diff>